<commit_message>
docx: real bookmarks and a clickable contents
The contents page was plain text. build_docx.py stripped [label](#anchor) down to
its label, and emitted no bookmarks at all, so nothing in the index navigated -
which is why 'whether the index stayed clickable' went unverified last time. It
wasn't.

Now every heading carries a w:bookmarkStart/End named from the same slug rule
build_prd.py uses for HTML ids, so one source drives both outputs, and every
[label](#anchor) becomes a w:hyperlink w:anchor. External links get a proper
TargetMode=External relationship.

Verified on the latest PRD: 42 bookmarks, 23 internal hyperlinks - one per
contents entry - 1 external, no dangling anchors, valid zip.

Co-Authored-By: Claude Opus 5 (1M context) <noreply@anthropic.com>
</commit_message>
<xml_diff>
--- a/docs/prd/latest/Zoho Webinar in Zoho CRM.docx
+++ b/docs/prd/latest/Zoho Webinar in Zoho CRM.docx
@@ -6,22 +6,32 @@
       <w:pPr>
         <w:pStyle w:val="Heading1"/>
       </w:pPr>
+      <w:bookmarkStart w:id="1" w:name="_zoho_webinar_in_zoho_crm"/>
       <w:r>
         <w:t xml:space="preserve">Zoho Webinar in Zoho CRM</w:t>
       </w:r>
-    </w:p>
-    <w:p>
-      <w:r>
-        <w:t xml:space="preserve">Figma — CRM and Webinar Integration</w:t>
-      </w:r>
+      <w:bookmarkEnd w:id="1"/>
+    </w:p>
+    <w:p>
+      <w:hyperlink r:id="rIdExt1">
+        <w:r>
+          <w:rPr>
+            <w:color w:val="5464F2"/>
+            <w:u w:val="single"/>
+          </w:rPr>
+          <w:t xml:space="preserve">Figma — CRM and Webinar Integration</w:t>
+        </w:r>
+      </w:hyperlink>
     </w:p>
     <w:p>
       <w:pPr>
         <w:pStyle w:val="Heading2"/>
       </w:pPr>
+      <w:bookmarkStart w:id="2" w:name="_contents"/>
       <w:r>
         <w:t xml:space="preserve">Contents</w:t>
       </w:r>
+      <w:bookmarkEnd w:id="2"/>
     </w:p>
     <w:p>
       <w:pPr>
@@ -35,7 +45,22 @@
         <w:rPr>
           <w:b/>
         </w:rPr>
-        <w:t xml:space="preserve">1. Integration</w:t>
+        <w:t xml:space="preserve"/>
+      </w:r>
+      <w:hyperlink w:anchor="_1_integration">
+        <w:r>
+          <w:rPr>
+            <w:color w:val="5464F2"/>
+            <w:u w:val="single"/>
+          </w:rPr>
+          <w:t xml:space="preserve">1. Integration</w:t>
+        </w:r>
+      </w:hyperlink>
+      <w:r>
+        <w:rPr>
+          <w:b/>
+        </w:rPr>
+        <w:t xml:space="preserve"/>
       </w:r>
     </w:p>
     <w:p>
@@ -46,9 +71,15 @@
           <w:numId w:val="1"/>
         </w:numPr>
       </w:pPr>
-      <w:r>
-        <w:t xml:space="preserve">1.1 Who can participate from CRM</w:t>
-      </w:r>
+      <w:hyperlink w:anchor="_1_1_who_can_participate_from_crm">
+        <w:r>
+          <w:rPr>
+            <w:color w:val="5464F2"/>
+            <w:u w:val="single"/>
+          </w:rPr>
+          <w:t xml:space="preserve">1.1 Who can participate from CRM</w:t>
+        </w:r>
+      </w:hyperlink>
     </w:p>
     <w:p>
       <w:pPr>
@@ -58,9 +89,15 @@
           <w:numId w:val="1"/>
         </w:numPr>
       </w:pPr>
-      <w:r>
-        <w:t xml:space="preserve">1.2 Webinar deal attribution</w:t>
-      </w:r>
+      <w:hyperlink w:anchor="_1_2_webinar_deal_attribution">
+        <w:r>
+          <w:rPr>
+            <w:color w:val="5464F2"/>
+            <w:u w:val="single"/>
+          </w:rPr>
+          <w:t xml:space="preserve">1.2 Webinar deal attribution</w:t>
+        </w:r>
+      </w:hyperlink>
     </w:p>
     <w:p>
       <w:pPr>
@@ -74,7 +111,22 @@
         <w:rPr>
           <w:b/>
         </w:rPr>
-        <w:t xml:space="preserve">2. Webinar list page</w:t>
+        <w:t xml:space="preserve"/>
+      </w:r>
+      <w:hyperlink w:anchor="_2_webinar_list_page">
+        <w:r>
+          <w:rPr>
+            <w:color w:val="5464F2"/>
+            <w:u w:val="single"/>
+          </w:rPr>
+          <w:t xml:space="preserve">2. Webinar list page</w:t>
+        </w:r>
+      </w:hyperlink>
+      <w:r>
+        <w:rPr>
+          <w:b/>
+        </w:rPr>
+        <w:t xml:space="preserve"/>
       </w:r>
     </w:p>
     <w:p>
@@ -89,7 +141,22 @@
         <w:rPr>
           <w:b/>
         </w:rPr>
-        <w:t xml:space="preserve">3. Create webinar</w:t>
+        <w:t xml:space="preserve"/>
+      </w:r>
+      <w:hyperlink w:anchor="_3_create_webinar">
+        <w:r>
+          <w:rPr>
+            <w:color w:val="5464F2"/>
+            <w:u w:val="single"/>
+          </w:rPr>
+          <w:t xml:space="preserve">3. Create webinar</w:t>
+        </w:r>
+      </w:hyperlink>
+      <w:r>
+        <w:rPr>
+          <w:b/>
+        </w:rPr>
+        <w:t xml:space="preserve"/>
       </w:r>
     </w:p>
     <w:p>
@@ -100,9 +167,15 @@
           <w:numId w:val="1"/>
         </w:numPr>
       </w:pPr>
-      <w:r>
-        <w:t xml:space="preserve">3.1 Live webinar</w:t>
-      </w:r>
+      <w:hyperlink w:anchor="_3_1_live_webinar">
+        <w:r>
+          <w:rPr>
+            <w:color w:val="5464F2"/>
+            <w:u w:val="single"/>
+          </w:rPr>
+          <w:t xml:space="preserve">3.1 Live webinar</w:t>
+        </w:r>
+      </w:hyperlink>
     </w:p>
     <w:p>
       <w:pPr>
@@ -112,9 +185,15 @@
           <w:numId w:val="1"/>
         </w:numPr>
       </w:pPr>
-      <w:r>
-        <w:t xml:space="preserve">3.2 On-demand webinar</w:t>
-      </w:r>
+      <w:hyperlink w:anchor="_3_2_on_demand_webinar">
+        <w:r>
+          <w:rPr>
+            <w:color w:val="5464F2"/>
+            <w:u w:val="single"/>
+          </w:rPr>
+          <w:t xml:space="preserve">3.2 On-demand webinar</w:t>
+        </w:r>
+      </w:hyperlink>
     </w:p>
     <w:p>
       <w:pPr>
@@ -124,9 +203,15 @@
           <w:numId w:val="1"/>
         </w:numPr>
       </w:pPr>
-      <w:r>
-        <w:t xml:space="preserve">3.3 New fields</w:t>
-      </w:r>
+      <w:hyperlink w:anchor="_3_3_new_fields">
+        <w:r>
+          <w:rPr>
+            <w:color w:val="5464F2"/>
+            <w:u w:val="single"/>
+          </w:rPr>
+          <w:t xml:space="preserve">3.3 New fields</w:t>
+        </w:r>
+      </w:hyperlink>
     </w:p>
     <w:p>
       <w:pPr>
@@ -140,7 +225,22 @@
         <w:rPr>
           <w:b/>
         </w:rPr>
-        <w:t xml:space="preserve">4. Scheduled webinar</w:t>
+        <w:t xml:space="preserve"/>
+      </w:r>
+      <w:hyperlink w:anchor="_4_scheduled_webinar">
+        <w:r>
+          <w:rPr>
+            <w:color w:val="5464F2"/>
+            <w:u w:val="single"/>
+          </w:rPr>
+          <w:t xml:space="preserve">4. Scheduled webinar</w:t>
+        </w:r>
+      </w:hyperlink>
+      <w:r>
+        <w:rPr>
+          <w:b/>
+        </w:rPr>
+        <w:t xml:space="preserve"/>
       </w:r>
     </w:p>
     <w:p>
@@ -151,9 +251,15 @@
           <w:numId w:val="1"/>
         </w:numPr>
       </w:pPr>
-      <w:r>
-        <w:t xml:space="preserve">4.1 Send Invite</w:t>
-      </w:r>
+      <w:hyperlink w:anchor="_4_1_send_invite">
+        <w:r>
+          <w:rPr>
+            <w:color w:val="5464F2"/>
+            <w:u w:val="single"/>
+          </w:rPr>
+          <w:t xml:space="preserve">4.1 Send Invite</w:t>
+        </w:r>
+      </w:hyperlink>
     </w:p>
     <w:p>
       <w:pPr>
@@ -163,9 +269,15 @@
           <w:numId w:val="1"/>
         </w:numPr>
       </w:pPr>
-      <w:r>
-        <w:t xml:space="preserve">4.2 View registration source</w:t>
-      </w:r>
+      <w:hyperlink w:anchor="_4_2_view_registration_source">
+        <w:r>
+          <w:rPr>
+            <w:color w:val="5464F2"/>
+            <w:u w:val="single"/>
+          </w:rPr>
+          <w:t xml:space="preserve">4.2 View registration source</w:t>
+        </w:r>
+      </w:hyperlink>
     </w:p>
     <w:p>
       <w:pPr>
@@ -175,9 +287,15 @@
           <w:numId w:val="1"/>
         </w:numPr>
       </w:pPr>
-      <w:r>
-        <w:t xml:space="preserve">4.3 Registration &amp; Attendance Summary</w:t>
-      </w:r>
+      <w:hyperlink w:anchor="_4_3_registration_attendance_summary">
+        <w:r>
+          <w:rPr>
+            <w:color w:val="5464F2"/>
+            <w:u w:val="single"/>
+          </w:rPr>
+          <w:t xml:space="preserve">4.3 Registration &amp; Attendance Summary</w:t>
+        </w:r>
+      </w:hyperlink>
     </w:p>
     <w:p>
       <w:pPr>
@@ -187,9 +305,15 @@
           <w:numId w:val="1"/>
         </w:numPr>
       </w:pPr>
-      <w:r>
-        <w:t xml:space="preserve">4.4 Poll creation</w:t>
-      </w:r>
+      <w:hyperlink w:anchor="_4_4_poll_creation">
+        <w:r>
+          <w:rPr>
+            <w:color w:val="5464F2"/>
+            <w:u w:val="single"/>
+          </w:rPr>
+          <w:t xml:space="preserve">4.4 Poll creation</w:t>
+        </w:r>
+      </w:hyperlink>
     </w:p>
     <w:p>
       <w:pPr>
@@ -199,9 +323,15 @@
           <w:numId w:val="1"/>
         </w:numPr>
       </w:pPr>
-      <w:r>
-        <w:t xml:space="preserve">4.5 Session Files</w:t>
-      </w:r>
+      <w:hyperlink w:anchor="_4_5_session_files">
+        <w:r>
+          <w:rPr>
+            <w:color w:val="5464F2"/>
+            <w:u w:val="single"/>
+          </w:rPr>
+          <w:t xml:space="preserve">4.5 Session Files</w:t>
+        </w:r>
+      </w:hyperlink>
     </w:p>
     <w:p>
       <w:pPr>
@@ -211,9 +341,15 @@
           <w:numId w:val="1"/>
         </w:numPr>
       </w:pPr>
-      <w:r>
-        <w:t xml:space="preserve">4.6 Actions</w:t>
-      </w:r>
+      <w:hyperlink w:anchor="_4_6_actions">
+        <w:r>
+          <w:rPr>
+            <w:color w:val="5464F2"/>
+            <w:u w:val="single"/>
+          </w:rPr>
+          <w:t xml:space="preserve">4.6 Actions</w:t>
+        </w:r>
+      </w:hyperlink>
     </w:p>
     <w:p>
       <w:pPr>
@@ -227,7 +363,22 @@
         <w:rPr>
           <w:b/>
         </w:rPr>
-        <w:t xml:space="preserve">5. Completed webinar</w:t>
+        <w:t xml:space="preserve"/>
+      </w:r>
+      <w:hyperlink w:anchor="_5_completed_webinar">
+        <w:r>
+          <w:rPr>
+            <w:color w:val="5464F2"/>
+            <w:u w:val="single"/>
+          </w:rPr>
+          <w:t xml:space="preserve">5. Completed webinar</w:t>
+        </w:r>
+      </w:hyperlink>
+      <w:r>
+        <w:rPr>
+          <w:b/>
+        </w:rPr>
+        <w:t xml:space="preserve"/>
       </w:r>
     </w:p>
     <w:p>
@@ -238,9 +389,15 @@
           <w:numId w:val="1"/>
         </w:numPr>
       </w:pPr>
-      <w:r>
-        <w:t xml:space="preserve">5.1 Registration &amp; Attendance Summary</w:t>
-      </w:r>
+      <w:hyperlink w:anchor="_5_1_registration_attendance_summary">
+        <w:r>
+          <w:rPr>
+            <w:color w:val="5464F2"/>
+            <w:u w:val="single"/>
+          </w:rPr>
+          <w:t xml:space="preserve">5.1 Registration &amp; Attendance Summary</w:t>
+        </w:r>
+      </w:hyperlink>
     </w:p>
     <w:p>
       <w:pPr>
@@ -250,9 +407,15 @@
           <w:numId w:val="1"/>
         </w:numPr>
       </w:pPr>
-      <w:r>
-        <w:t xml:space="preserve">5.2 Webinar Revenue</w:t>
-      </w:r>
+      <w:hyperlink w:anchor="_5_2_webinar_revenue">
+        <w:r>
+          <w:rPr>
+            <w:color w:val="5464F2"/>
+            <w:u w:val="single"/>
+          </w:rPr>
+          <w:t xml:space="preserve">5.2 Webinar Revenue</w:t>
+        </w:r>
+      </w:hyperlink>
     </w:p>
     <w:p>
       <w:pPr>
@@ -262,9 +425,15 @@
           <w:numId w:val="1"/>
         </w:numPr>
       </w:pPr>
-      <w:r>
-        <w:t xml:space="preserve">5.3 Invited related list</w:t>
-      </w:r>
+      <w:hyperlink w:anchor="_5_3_invited_related_list">
+        <w:r>
+          <w:rPr>
+            <w:color w:val="5464F2"/>
+            <w:u w:val="single"/>
+          </w:rPr>
+          <w:t xml:space="preserve">5.3 Invited related list</w:t>
+        </w:r>
+      </w:hyperlink>
     </w:p>
     <w:p>
       <w:pPr>
@@ -274,9 +443,15 @@
           <w:numId w:val="1"/>
         </w:numPr>
       </w:pPr>
-      <w:r>
-        <w:t xml:space="preserve">5.4 Polls</w:t>
-      </w:r>
+      <w:hyperlink w:anchor="_5_4_polls">
+        <w:r>
+          <w:rPr>
+            <w:color w:val="5464F2"/>
+            <w:u w:val="single"/>
+          </w:rPr>
+          <w:t xml:space="preserve">5.4 Polls</w:t>
+        </w:r>
+      </w:hyperlink>
     </w:p>
     <w:p>
       <w:pPr>
@@ -286,9 +461,15 @@
           <w:numId w:val="1"/>
         </w:numPr>
       </w:pPr>
-      <w:r>
-        <w:t xml:space="preserve">5.5 Q&amp;A</w:t>
-      </w:r>
+      <w:hyperlink w:anchor="_5_5_q_a">
+        <w:r>
+          <w:rPr>
+            <w:color w:val="5464F2"/>
+            <w:u w:val="single"/>
+          </w:rPr>
+          <w:t xml:space="preserve">5.5 Q&amp;A</w:t>
+        </w:r>
+      </w:hyperlink>
     </w:p>
     <w:p>
       <w:pPr>
@@ -302,7 +483,22 @@
         <w:rPr>
           <w:b/>
         </w:rPr>
-        <w:t xml:space="preserve">Things we still need to decide</w:t>
+        <w:t xml:space="preserve"/>
+      </w:r>
+      <w:hyperlink w:anchor="_things_we_still_need_to_decide">
+        <w:r>
+          <w:rPr>
+            <w:color w:val="5464F2"/>
+            <w:u w:val="single"/>
+          </w:rPr>
+          <w:t xml:space="preserve">Things we still need to decide</w:t>
+        </w:r>
+      </w:hyperlink>
+      <w:r>
+        <w:rPr>
+          <w:b/>
+        </w:rPr>
+        <w:t xml:space="preserve"/>
       </w:r>
     </w:p>
     <w:p>
@@ -317,24 +513,43 @@
         <w:rPr>
           <w:b/>
         </w:rPr>
-        <w:t xml:space="preserve">Appendix A — every field in the create form</w:t>
+        <w:t xml:space="preserve"/>
+      </w:r>
+      <w:hyperlink w:anchor="_appendix_a_every_field_in_the_create_fo">
+        <w:r>
+          <w:rPr>
+            <w:color w:val="5464F2"/>
+            <w:u w:val="single"/>
+          </w:rPr>
+          <w:t xml:space="preserve">Appendix A — every field in the create form</w:t>
+        </w:r>
+      </w:hyperlink>
+      <w:r>
+        <w:rPr>
+          <w:b/>
+        </w:rPr>
+        <w:t xml:space="preserve"/>
       </w:r>
     </w:p>
     <w:p>
       <w:pPr>
         <w:pStyle w:val="Heading2"/>
       </w:pPr>
+      <w:bookmarkStart w:id="3" w:name="_introduction"/>
       <w:r>
         <w:t xml:space="preserve">Introduction</w:t>
       </w:r>
+      <w:bookmarkEnd w:id="3"/>
     </w:p>
     <w:p>
       <w:pPr>
         <w:pStyle w:val="Heading3"/>
       </w:pPr>
+      <w:bookmarkStart w:id="4" w:name="_what_is_zoho_webinar"/>
       <w:r>
         <w:t xml:space="preserve">What is Zoho Webinar</w:t>
       </w:r>
+      <w:bookmarkEnd w:id="4"/>
     </w:p>
     <w:p>
       <w:r>
@@ -359,9 +574,11 @@
       <w:pPr>
         <w:pStyle w:val="Heading3"/>
       </w:pPr>
+      <w:bookmarkStart w:id="5" w:name="_who_uses_it"/>
       <w:r>
         <w:t xml:space="preserve">Who uses it</w:t>
       </w:r>
+      <w:bookmarkEnd w:id="5"/>
     </w:p>
     <w:p>
       <w:r>
@@ -472,9 +689,11 @@
       <w:pPr>
         <w:pStyle w:val="Heading3"/>
       </w:pPr>
+      <w:bookmarkStart w:id="6" w:name="_why_this_integration_and_what_it_solves"/>
       <w:r>
         <w:t xml:space="preserve">Why this integration, and what it solves</w:t>
       </w:r>
+      <w:bookmarkEnd w:id="6"/>
     </w:p>
     <w:p>
       <w:r>
@@ -652,9 +871,11 @@
       <w:pPr>
         <w:pStyle w:val="Heading1"/>
       </w:pPr>
+      <w:bookmarkStart w:id="7" w:name="_1_integration"/>
       <w:r>
         <w:t xml:space="preserve">1. Integration</w:t>
       </w:r>
+      <w:bookmarkEnd w:id="7"/>
     </w:p>
     <w:p>
       <w:r>
@@ -1430,9 +1651,11 @@
       <w:pPr>
         <w:pStyle w:val="Heading2"/>
       </w:pPr>
+      <w:bookmarkStart w:id="8" w:name="_1_1_who_can_participate_from_crm"/>
       <w:r>
         <w:t xml:space="preserve">1.1 Who can participate from CRM</w:t>
       </w:r>
+      <w:bookmarkEnd w:id="8"/>
     </w:p>
     <w:p>
       <w:r>
@@ -2299,9 +2522,11 @@
       <w:pPr>
         <w:pStyle w:val="Heading2"/>
       </w:pPr>
+      <w:bookmarkStart w:id="9" w:name="_1_2_webinar_deal_attribution"/>
       <w:r>
         <w:t xml:space="preserve">1.2 Webinar deal attribution</w:t>
       </w:r>
+      <w:bookmarkEnd w:id="9"/>
     </w:p>
     <w:p>
       <w:r>
@@ -2853,9 +3078,11 @@
       <w:pPr>
         <w:pStyle w:val="Heading1"/>
       </w:pPr>
+      <w:bookmarkStart w:id="10" w:name="_2_webinar_list_page"/>
       <w:r>
         <w:t xml:space="preserve">2. Webinar list page</w:t>
       </w:r>
+      <w:bookmarkEnd w:id="10"/>
     </w:p>
     <w:p>
       <w:r>
@@ -3581,9 +3808,11 @@
       <w:pPr>
         <w:pStyle w:val="Heading1"/>
       </w:pPr>
+      <w:bookmarkStart w:id="11" w:name="_3_create_webinar"/>
       <w:r>
         <w:t xml:space="preserve">3. Create webinar</w:t>
       </w:r>
+      <w:bookmarkEnd w:id="11"/>
     </w:p>
     <w:p>
       <w:r>
@@ -3904,9 +4133,11 @@
       <w:pPr>
         <w:pStyle w:val="Heading2"/>
       </w:pPr>
+      <w:bookmarkStart w:id="12" w:name="_3_1_live_webinar"/>
       <w:r>
         <w:t xml:space="preserve">3.1 Live webinar</w:t>
       </w:r>
+      <w:bookmarkEnd w:id="12"/>
     </w:p>
     <w:p>
       <w:r>
@@ -7291,9 +7522,11 @@
       <w:pPr>
         <w:pStyle w:val="Heading2"/>
       </w:pPr>
+      <w:bookmarkStart w:id="13" w:name="_3_2_on_demand_webinar"/>
       <w:r>
         <w:t xml:space="preserve">3.2 On-demand webinar</w:t>
       </w:r>
+      <w:bookmarkEnd w:id="13"/>
     </w:p>
     <w:p>
       <w:r>
@@ -8019,9 +8252,11 @@
       <w:pPr>
         <w:pStyle w:val="Heading2"/>
       </w:pPr>
+      <w:bookmarkStart w:id="14" w:name="_3_3_new_fields"/>
       <w:r>
         <w:t xml:space="preserve">3.3 New fields</w:t>
       </w:r>
+      <w:bookmarkEnd w:id="14"/>
     </w:p>
     <w:p>
       <w:r>
@@ -8032,9 +8267,11 @@
       <w:pPr>
         <w:pStyle w:val="Heading3"/>
       </w:pPr>
+      <w:bookmarkStart w:id="15" w:name="_1_webinar_owner"/>
       <w:r>
         <w:t xml:space="preserve">1. Webinar Owner</w:t>
       </w:r>
+      <w:bookmarkEnd w:id="15"/>
     </w:p>
     <w:tbl>
       <w:tblPr>
@@ -8329,9 +8566,11 @@
       <w:pPr>
         <w:pStyle w:val="Heading3"/>
       </w:pPr>
+      <w:bookmarkStart w:id="16" w:name="_2_webinar_cost"/>
       <w:r>
         <w:t xml:space="preserve">2. Webinar Cost</w:t>
       </w:r>
+      <w:bookmarkEnd w:id="16"/>
     </w:p>
     <w:tbl>
       <w:tblPr>
@@ -8780,9 +9019,11 @@
       <w:pPr>
         <w:pStyle w:val="Heading3"/>
       </w:pPr>
+      <w:bookmarkStart w:id="17" w:name="_3_registration_form"/>
       <w:r>
         <w:t xml:space="preserve">3. Registration Form</w:t>
       </w:r>
+      <w:bookmarkEnd w:id="17"/>
     </w:p>
     <w:tbl>
       <w:tblPr>
@@ -9178,9 +9419,11 @@
       <w:pPr>
         <w:pStyle w:val="Heading3"/>
       </w:pPr>
+      <w:bookmarkStart w:id="18" w:name="_4_push_webinar_registrants_to_crm"/>
       <w:r>
         <w:t xml:space="preserve">4. Push Webinar Registrants to CRM</w:t>
       </w:r>
+      <w:bookmarkEnd w:id="18"/>
     </w:p>
     <w:tbl>
       <w:tblPr>
@@ -9604,9 +9847,11 @@
       <w:pPr>
         <w:pStyle w:val="Heading1"/>
       </w:pPr>
+      <w:bookmarkStart w:id="19" w:name="_4_scheduled_webinar"/>
       <w:r>
         <w:t xml:space="preserve">4. Scheduled webinar</w:t>
       </w:r>
+      <w:bookmarkEnd w:id="19"/>
     </w:p>
     <w:p>
       <w:r>
@@ -9848,9 +10093,11 @@
       <w:pPr>
         <w:pStyle w:val="Heading2"/>
       </w:pPr>
+      <w:bookmarkStart w:id="20" w:name="_4_1_send_invite"/>
       <w:r>
         <w:t xml:space="preserve">4.1 Send Invite</w:t>
       </w:r>
+      <w:bookmarkEnd w:id="20"/>
     </w:p>
     <w:p>
       <w:r>
@@ -10431,9 +10678,11 @@
       <w:pPr>
         <w:pStyle w:val="Heading2"/>
       </w:pPr>
+      <w:bookmarkStart w:id="21" w:name="_4_2_view_registration_source"/>
       <w:r>
         <w:t xml:space="preserve">4.2 View registration source</w:t>
       </w:r>
+      <w:bookmarkEnd w:id="21"/>
     </w:p>
     <w:p>
       <w:r>
@@ -10819,9 +11068,11 @@
       <w:pPr>
         <w:pStyle w:val="Heading2"/>
       </w:pPr>
+      <w:bookmarkStart w:id="22" w:name="_4_3_registration_attendance_summary"/>
       <w:r>
         <w:t xml:space="preserve">4.3 Registration &amp; Attendance Summary</w:t>
       </w:r>
+      <w:bookmarkEnd w:id="22"/>
     </w:p>
     <w:p>
       <w:r>
@@ -11273,9 +11524,11 @@
       <w:pPr>
         <w:pStyle w:val="Heading2"/>
       </w:pPr>
+      <w:bookmarkStart w:id="23" w:name="_4_4_poll_creation"/>
       <w:r>
         <w:t xml:space="preserve">4.4 Poll creation</w:t>
       </w:r>
+      <w:bookmarkEnd w:id="23"/>
     </w:p>
     <w:p>
       <w:r>
@@ -11493,9 +11746,11 @@
       <w:pPr>
         <w:pStyle w:val="Heading2"/>
       </w:pPr>
+      <w:bookmarkStart w:id="24" w:name="_4_5_session_files"/>
       <w:r>
         <w:t xml:space="preserve">4.5 Session Files</w:t>
       </w:r>
+      <w:bookmarkEnd w:id="24"/>
     </w:p>
     <w:p>
       <w:r>
@@ -11842,9 +12097,11 @@
       <w:pPr>
         <w:pStyle w:val="Heading2"/>
       </w:pPr>
+      <w:bookmarkStart w:id="25" w:name="_4_6_actions"/>
       <w:r>
         <w:t xml:space="preserve">4.6 Actions</w:t>
       </w:r>
+      <w:bookmarkEnd w:id="25"/>
     </w:p>
     <w:p>
       <w:r>
@@ -12550,9 +12807,11 @@
       <w:pPr>
         <w:pStyle w:val="Heading1"/>
       </w:pPr>
+      <w:bookmarkStart w:id="26" w:name="_5_completed_webinar"/>
       <w:r>
         <w:t xml:space="preserve">5. Completed webinar</w:t>
       </w:r>
+      <w:bookmarkEnd w:id="26"/>
     </w:p>
     <w:p>
       <w:r>
@@ -12678,9 +12937,11 @@
       <w:pPr>
         <w:pStyle w:val="Heading2"/>
       </w:pPr>
+      <w:bookmarkStart w:id="27" w:name="_5_1_registration_attendance_summary"/>
       <w:r>
         <w:t xml:space="preserve">5.1 Registration &amp; Attendance Summary</w:t>
       </w:r>
+      <w:bookmarkEnd w:id="27"/>
     </w:p>
     <w:p>
       <w:r>
@@ -13511,9 +13772,11 @@
       <w:pPr>
         <w:pStyle w:val="Heading2"/>
       </w:pPr>
+      <w:bookmarkStart w:id="28" w:name="_5_2_webinar_revenue"/>
       <w:r>
         <w:t xml:space="preserve">5.2 Webinar Revenue</w:t>
       </w:r>
+      <w:bookmarkEnd w:id="28"/>
     </w:p>
     <w:p>
       <w:r>
@@ -14155,9 +14418,11 @@
       <w:pPr>
         <w:pStyle w:val="Heading2"/>
       </w:pPr>
+      <w:bookmarkStart w:id="29" w:name="_5_3_invited_related_list"/>
       <w:r>
         <w:t xml:space="preserve">5.3 Invited related list</w:t>
       </w:r>
+      <w:bookmarkEnd w:id="29"/>
     </w:p>
     <w:p>
       <w:r>
@@ -14608,9 +14873,11 @@
       <w:pPr>
         <w:pStyle w:val="Heading2"/>
       </w:pPr>
+      <w:bookmarkStart w:id="30" w:name="_5_4_polls"/>
       <w:r>
         <w:t xml:space="preserve">5.4 Polls</w:t>
       </w:r>
+      <w:bookmarkEnd w:id="30"/>
     </w:p>
     <w:p>
       <w:r>
@@ -14867,9 +15134,11 @@
       <w:pPr>
         <w:pStyle w:val="Heading2"/>
       </w:pPr>
+      <w:bookmarkStart w:id="31" w:name="_5_5_q_a"/>
       <w:r>
         <w:t xml:space="preserve">5.5 Q&amp;A</w:t>
       </w:r>
+      <w:bookmarkEnd w:id="31"/>
     </w:p>
     <w:p>
       <w:r>
@@ -15391,17 +15660,21 @@
       <w:pPr>
         <w:pStyle w:val="Heading1"/>
       </w:pPr>
+      <w:bookmarkStart w:id="32" w:name="_things_we_still_need_to_decide"/>
       <w:r>
         <w:t xml:space="preserve">Things we still need to decide</w:t>
       </w:r>
+      <w:bookmarkEnd w:id="32"/>
     </w:p>
     <w:p>
       <w:pPr>
         <w:pStyle w:val="Heading3"/>
       </w:pPr>
+      <w:bookmarkStart w:id="33" w:name="_blocking"/>
       <w:r>
         <w:t xml:space="preserve">Blocking</w:t>
       </w:r>
+      <w:bookmarkEnd w:id="33"/>
     </w:p>
     <w:p>
       <w:pPr>
@@ -15476,9 +15749,11 @@
       <w:pPr>
         <w:pStyle w:val="Heading3"/>
       </w:pPr>
+      <w:bookmarkStart w:id="34" w:name="_product"/>
       <w:r>
         <w:t xml:space="preserve">Product</w:t>
       </w:r>
+      <w:bookmarkEnd w:id="34"/>
     </w:p>
     <w:p>
       <w:pPr>
@@ -15757,9 +16032,11 @@
       <w:pPr>
         <w:pStyle w:val="Heading3"/>
       </w:pPr>
+      <w:bookmarkStart w:id="35" w:name="_engineering"/>
       <w:r>
         <w:t xml:space="preserve">Engineering</w:t>
       </w:r>
+      <w:bookmarkEnd w:id="35"/>
     </w:p>
     <w:p>
       <w:pPr>
@@ -15894,9 +16171,11 @@
       <w:pPr>
         <w:pStyle w:val="Heading3"/>
       </w:pPr>
+      <w:bookmarkStart w:id="36" w:name="_design"/>
       <w:r>
         <w:t xml:space="preserve">Design</w:t>
       </w:r>
+      <w:bookmarkEnd w:id="36"/>
     </w:p>
     <w:p>
       <w:pPr>
@@ -16027,9 +16306,11 @@
       <w:pPr>
         <w:pStyle w:val="Heading3"/>
       </w:pPr>
+      <w:bookmarkStart w:id="37" w:name="_assumptions_this_document_makes"/>
       <w:r>
         <w:t xml:space="preserve">Assumptions this document makes</w:t>
       </w:r>
+      <w:bookmarkEnd w:id="37"/>
     </w:p>
     <w:p>
       <w:pPr>
@@ -16090,9 +16371,11 @@
       <w:pPr>
         <w:pStyle w:val="Heading3"/>
       </w:pPr>
+      <w:bookmarkStart w:id="38" w:name="_mock_defects_do_not_reproduce"/>
       <w:r>
         <w:t xml:space="preserve">Mock defects — do not reproduce</w:t>
       </w:r>
+      <w:bookmarkEnd w:id="38"/>
     </w:p>
     <w:p>
       <w:pPr>
@@ -16230,9 +16513,11 @@
       <w:pPr>
         <w:pStyle w:val="Heading1"/>
       </w:pPr>
+      <w:bookmarkStart w:id="39" w:name="_appendix_a_every_field_in_the_create_fo"/>
       <w:r>
         <w:t xml:space="preserve">Appendix A — every field in the create form</w:t>
       </w:r>
+      <w:bookmarkEnd w:id="39"/>
     </w:p>
     <w:p>
       <w:r>
@@ -20689,9 +20974,11 @@
       <w:pPr>
         <w:pStyle w:val="Heading2"/>
       </w:pPr>
+      <w:bookmarkStart w:id="40" w:name="_picklist_options_verbatim"/>
       <w:r>
         <w:t xml:space="preserve">Picklist options, verbatim</w:t>
       </w:r>
+      <w:bookmarkEnd w:id="40"/>
     </w:p>
     <w:tbl>
       <w:tblPr>
@@ -21099,9 +21386,11 @@
       <w:pPr>
         <w:pStyle w:val="Heading2"/>
       </w:pPr>
+      <w:bookmarkStart w:id="41" w:name="_integration_constants"/>
       <w:r>
         <w:t xml:space="preserve">Integration constants</w:t>
       </w:r>
+      <w:bookmarkEnd w:id="41"/>
     </w:p>
     <w:p>
       <w:r>
@@ -21154,9 +21443,11 @@
       <w:pPr>
         <w:pStyle w:val="Heading2"/>
       </w:pPr>
+      <w:bookmarkStart w:id="42" w:name="_where_each_flow_starts_for_testing"/>
       <w:r>
         <w:t xml:space="preserve">Where each flow starts, for testing</w:t>
       </w:r>
+      <w:bookmarkEnd w:id="42"/>
     </w:p>
     <w:tbl>
       <w:tblPr>

</xml_diff>